<commit_message>
Sua trich dan: boi thuong theo Dieu 18 Quy dinh quan ly, su dung phong TN - TH (thay Dieu 24 QLTS); them ghi chu cho PL2A-2C
Co-Authored-By: Claude Opus 5.5 <noreply@anthropic.com>
</commit_message>
<xml_diff>
--- a/bieu-mau/PL2A_Don-de-nghi-muon-dung-cu_NCKH.docx
+++ b/bieu-mau/PL2A_Don-de-nghi-muon-dung-cu_NCKH.docx
@@ -1789,10 +1789,19 @@
       </w:pPr>
       <w:r>
         <w:rPr>
+          <w:i/>
+          <w:iCs/>
           <w:sz w:val="24"/>
           <w:szCs w:val="24"/>
         </w:rPr>
-        <w:t>Chúng tôi chân thành cảm ơn.</w:t>
+        <w:t>Ghi chú:</w:t>
+      </w:r>
+      <w:r>
+        <w:rPr>
+          <w:sz w:val="24"/>
+          <w:szCs w:val="24"/>
+        </w:rPr>
+        <w:t xml:space="preserve"> Việc bồi thường (nếu có) được xử lý theo Điều 18 Quy định quản lý, sử dụng phòng TN – TH của Khoa, độc lập với việc công nhận kết quả học tập. Chúng tôi chân thành cảm ơn.</w:t>
       </w:r>
     </w:p>
     <w:p>

</xml_diff>